<commit_message>
Audit free animation files and document remaining Synty review
</commit_message>
<xml_diff>
--- a/Docs/중력정비반_개인프로젝트_기획서.docx
+++ b/Docs/중력정비반_개인프로젝트_기획서.docx
@@ -31,7 +31,7 @@
           <w:color w:val="000000"/>
           <w:sz w:val="22"/>
         </w:rPr>
-        <w:t>2026년 10월 26일 · 수정안 1.1 · 에셋과 애니메이션은 도입 전 검수 단계</w:t>
+        <w:t>2026년 10월 26일 · 수정안 1.2 · 무료 파일 검수 완료 및 A안 캐릭터 적용 검수 대기</w:t>
       </w:r>
     </w:p>
     <w:p>
@@ -4854,7 +4854,7 @@
           <w:color w:val="000000"/>
           <w:sz w:val="22"/>
         </w:rPr>
-        <w:t>아래는 무료 공개 목록과 제작자 문서에서 확인한 후보이며, 실제 패키지 파일과 Synty Avatar에서의 동작 검증은 미완료다. HumanM과 HumanF 중 사용할 체형을 정하고 패키지 버전을 기록한다. 무료 목록과 현재 배포 버전의 이름 차이도 첫 도입 시 확인한다.</w:t>
+        <w:t>아래는 무료 공개 목록과 실제 파일을 구분한 후보이다. Kevin 팩은 공개 무료 목록을 확인했으며 실제 배포 버전 대조가 남았다. 보완 후보인 Quaternius Standard 2팩은 제작자 공식 배포본의 Unity FBX를 별도 Unity 6000.6 프로젝트에서 확인했다. Synty Avatar 적용 검수는 아직 수행하지 않았다.</w:t>
       </w:r>
       <w:commentRangeEnd w:id="2"/>
       <w:r>
@@ -5403,7 +5403,7 @@
                 <w:color w:val="000000"/>
                 <w:sz w:val="20"/>
               </w:rPr>
-              <w:t>전투 대기·달리기 재사용, RPG Character Mecanim Animation Pack FREE의 Knockback과 Revive 후보</w:t>
+              <w:t>대기·달리기 재사용, Quaternius UAL2의 Hit_Knockback·LayToIdle</w:t>
             </w:r>
           </w:p>
         </w:tc>
@@ -5432,7 +5432,7 @@
                 <w:color w:val="000000"/>
                 <w:sz w:val="20"/>
               </w:rPr>
-              <w:t>전용 돌진 세트는 아님 · 구간·속도·무력화 자세 조합</w:t>
+              <w:t>전용 돌진 세트 아님 · 보완 FBX의 Humanoid와 포즈 확인 · 실제 연결 보정 필요</w:t>
             </w:r>
           </w:p>
         </w:tc>
@@ -5495,7 +5495,7 @@
                 <w:color w:val="000000"/>
                 <w:sz w:val="20"/>
               </w:rPr>
-              <w:t>RPG 무료 목록의 Unarmed-Knockback-Back1, Unarmed-Revive1</w:t>
+              <w:t>UAL2의 Hit_Knockback 0.833초·LayToIdle 1.533초</w:t>
             </w:r>
           </w:p>
         </w:tc>
@@ -5524,7 +5524,7 @@
                 <w:color w:val="000000"/>
                 <w:sz w:val="20"/>
               </w:rPr>
-              <w:t>마지막 자세 유지와 복귀의 포즈 연결을 실제 확인</w:t>
+              <w:t>넘어짐과 일어서기 포즈 확인 · 마지막 자세 유지·접합은 미검수</w:t>
             </w:r>
           </w:p>
         </w:tc>
@@ -5558,7 +5558,7 @@
                 <w:color w:val="000000"/>
                 <w:sz w:val="20"/>
               </w:rPr>
-              <w:t>동료 구조·고정 장치 조작</w:t>
+              <w:t>구조자·고정 장치 조작</w:t>
             </w:r>
           </w:p>
         </w:tc>
@@ -5587,7 +5587,7 @@
                 <w:color w:val="000000"/>
                 <w:sz w:val="20"/>
               </w:rPr>
-              <w:t>전용 버튼·레버·구조 클립은 미확보</w:t>
+              <w:t>UAL1의 Fixing_Kneeling 5.200초·Interact 2.000초</w:t>
             </w:r>
           </w:p>
         </w:tc>
@@ -5616,7 +5616,7 @@
                 <w:color w:val="000000"/>
                 <w:sz w:val="20"/>
               </w:rPr>
-              <w:t>기존 팔 자세 추출과 2~3키 보정 2~4시간 확보 · 접촉은 별도 검수</w:t>
+              <w:t>실제 포즈 확인 · 전용 구조·레버가 아님 · 3초 유지·취소·손 접촉 보정 필요</w:t>
             </w:r>
           </w:p>
         </w:tc>
@@ -5636,7 +5636,19 @@
           <w:color w:val="000000"/>
           <w:sz w:val="22"/>
         </w:rPr>
-        <w:t>처음 추천한 Crafting Mecanim 무료 팩의 Carry 계열은 실제 물체 운반에는 맞지만, 3m 중력 잡기에는 그대로 맞지 않는다. 필수 팩에서 제외하고 필요한 상태가 생길 때만 추가 검토한다. 단순히 무료 팩 수를 늘려 기획서의 동작을 모두 확보했다고 표현하지 않는다.</w:t>
+        <w:t>처음 추천한 Crafting의 Carry 계열은 3m 중력 잡기에 맞지 않아 필수에서 제외한다. Quaternius는 Asset Store 상품이 아닌 제작자의 CC0 공식 배포본이다. 두 원본 Avatar와 46개·43개 Humanoid 클립을 확인하고 8개 동작의 포즈 32장을 렌더링했다. Loop 이름의 클립도 현재 임포트에서는 반복 설정이 꺼져 있어 별도 설정·이음새 검수가 필요하다.</w:t>
+      </w:r>
+    </w:p>
+    <w:p>
+      <w:pPr/>
+      <w:r>
+        <w:rPr>
+          <w:rFonts w:ascii="맑은 고딕" w:hAnsi="맑은 고딕" w:eastAsia="맑은 고딕"/>
+          <w:b w:val="0"/>
+          <w:color w:val="000000"/>
+          <w:sz w:val="22"/>
+        </w:rPr>
+        <w:t>구조 3초는 호스트 판정 시간이며 5.2초 원본을 단순 가속하지 않는다. 진입·유지·퇴장을 나누고 취소를 검수한다. 다리 고정 장치를 버튼 형태로 표현하면 Interact가 후보가 되지만 외형과 접촉은 시각 검수 후 확정한다. 전용 레버 당기기를 새 필수 기능으로 추가하지 않는다. 종전 보정 2~4시간은 근거가 부족해 확정값에서 제외하고 에셋·Animator 예산 16~24시간 안에서 우선 시험한다.</w:t>
       </w:r>
     </w:p>
     <w:p>
@@ -10744,7 +10756,7 @@
                 <w:color w:val="000000"/>
                 <w:sz w:val="20"/>
               </w:rPr>
-              <w:t>POLYGON Starter Pack · Synty</w:t>
+              <w:t>POLYGON Starter Pack</w:t>
             </w:r>
           </w:p>
         </w:tc>
@@ -10836,7 +10848,7 @@
                 <w:color w:val="000000"/>
                 <w:sz w:val="20"/>
               </w:rPr>
-              <w:t>Sidekick Modular Characters FREE Starter Pack · Synty</w:t>
+              <w:t>Sidekick FREE</w:t>
             </w:r>
           </w:p>
         </w:tc>
@@ -10928,7 +10940,7 @@
                 <w:color w:val="000000"/>
                 <w:sz w:val="20"/>
               </w:rPr>
-              <w:t>Human Basic Motions FREE · Kevin Iglesias</w:t>
+              <w:t>Basic Motions FREE</w:t>
             </w:r>
           </w:p>
         </w:tc>
@@ -11020,7 +11032,7 @@
                 <w:color w:val="000000"/>
                 <w:sz w:val="20"/>
               </w:rPr>
-              <w:t>Human Melee Animations FREE · Kevin Iglesias</w:t>
+              <w:t>Melee FREE</w:t>
             </w:r>
           </w:p>
         </w:tc>
@@ -11112,7 +11124,7 @@
                 <w:color w:val="000000"/>
                 <w:sz w:val="20"/>
               </w:rPr>
-              <w:t>Human Spellcasting Animations FREE · Kevin Iglesias</w:t>
+              <w:t>Spellcasting FREE</w:t>
             </w:r>
           </w:p>
         </w:tc>
@@ -11204,7 +11216,7 @@
                 <w:color w:val="000000"/>
                 <w:sz w:val="20"/>
               </w:rPr>
-              <w:t>RPG Character Mecanim Animation Pack FREE · Explosive</w:t>
+              <w:t>UAL1 Standard</w:t>
             </w:r>
           </w:p>
         </w:tc>
@@ -11233,7 +11245,7 @@
                 <w:color w:val="000000"/>
                 <w:sz w:val="20"/>
               </w:rPr>
-              <w:t>다운·무력화·복귀에 필요한 일부 클립 후보</w:t>
+              <w:t>구조자·장치 조작과 장갑 대체안</w:t>
             </w:r>
           </w:p>
         </w:tc>
@@ -11262,7 +11274,99 @@
                 <w:color w:val="000000"/>
                 <w:sz w:val="20"/>
               </w:rPr>
-              <w:t>제작자 무료 목록 확인 · 배포 버전·포즈 연결 검수 필요</w:t>
+              <w:t>공식 무료 FBX의 Humanoid와 사용 후보 포즈 확인 · Synty 적용 전</w:t>
+            </w:r>
+          </w:p>
+        </w:tc>
+      </w:tr>
+      <w:tr>
+        <w:trPr>
+          <w:cantSplit/>
+        </w:trPr>
+        <w:tc>
+          <w:tcPr>
+            <w:tcW w:type="dxa" w:w="2016"/>
+            <w:vAlign w:val="center"/>
+            <w:shd w:fill="FFFFFF"/>
+            <w:tcMar>
+              <w:top w:w="70" w:type="dxa"/>
+              <w:left w:w="90" w:type="dxa"/>
+              <w:bottom w:w="70" w:type="dxa"/>
+              <w:right w:w="90" w:type="dxa"/>
+            </w:tcMar>
+          </w:tcPr>
+          <w:p>
+            <w:pPr>
+              <w:keepNext w:val="0"/>
+              <w:keepLines w:val="0"/>
+              <w:spacing w:after="60" w:before="60" w:line="259" w:lineRule="auto"/>
+            </w:pPr>
+            <w:r>
+              <w:rPr>
+                <w:rFonts w:ascii="맑은 고딕" w:hAnsi="맑은 고딕" w:eastAsia="맑은 고딕"/>
+                <w:b w:val="0"/>
+                <w:color w:val="000000"/>
+                <w:sz w:val="20"/>
+              </w:rPr>
+              <w:t>UAL2 Standard</w:t>
+            </w:r>
+          </w:p>
+        </w:tc>
+        <w:tc>
+          <w:tcPr>
+            <w:tcW w:type="dxa" w:w="4536"/>
+            <w:vAlign w:val="center"/>
+            <w:shd w:fill="FFFFFF"/>
+            <w:tcMar>
+              <w:top w:w="70" w:type="dxa"/>
+              <w:left w:w="90" w:type="dxa"/>
+              <w:bottom w:w="70" w:type="dxa"/>
+              <w:right w:w="90" w:type="dxa"/>
+            </w:tcMar>
+          </w:tcPr>
+          <w:p>
+            <w:pPr>
+              <w:keepNext w:val="0"/>
+              <w:keepLines w:val="0"/>
+              <w:spacing w:after="60" w:before="60" w:line="259" w:lineRule="auto"/>
+            </w:pPr>
+            <w:r>
+              <w:rPr>
+                <w:rFonts w:ascii="맑은 고딕" w:hAnsi="맑은 고딕" w:eastAsia="맑은 고딕"/>
+                <w:b w:val="0"/>
+                <w:color w:val="000000"/>
+                <w:sz w:val="20"/>
+              </w:rPr>
+              <w:t>다운·충돌·일어서기 보완</w:t>
+            </w:r>
+          </w:p>
+        </w:tc>
+        <w:tc>
+          <w:tcPr>
+            <w:tcW w:type="dxa" w:w="3672"/>
+            <w:vAlign w:val="center"/>
+            <w:shd w:fill="FFFFFF"/>
+            <w:tcMar>
+              <w:top w:w="70" w:type="dxa"/>
+              <w:left w:w="90" w:type="dxa"/>
+              <w:bottom w:w="70" w:type="dxa"/>
+              <w:right w:w="90" w:type="dxa"/>
+            </w:tcMar>
+          </w:tcPr>
+          <w:p>
+            <w:pPr>
+              <w:keepNext w:val="0"/>
+              <w:keepLines w:val="0"/>
+              <w:spacing w:after="60" w:before="60" w:line="259" w:lineRule="auto"/>
+            </w:pPr>
+            <w:r>
+              <w:rPr>
+                <w:rFonts w:ascii="맑은 고딕" w:hAnsi="맑은 고딕" w:eastAsia="맑은 고딕"/>
+                <w:b w:val="0"/>
+                <w:color w:val="000000"/>
+                <w:sz w:val="20"/>
+              </w:rPr>
+              <w:t>공식 무료 FBX의 Humanoid와 사용 후보 포즈 확인 · 상태 연결 전</w:t>
             </w:r>
           </w:p>
         </w:tc>
@@ -11282,7 +11386,7 @@
           <w:color w:val="000000"/>
           <w:sz w:val="22"/>
         </w:rPr>
-        <w:t>최종 애니메이션 조합은 사용자가 상태별 대응과 보완점을 확인한 뒤 확정한다. 현재는 에셋을 구매·추가·다운로드·프로젝트에 가져오지 않았다. 실제 에디터 검수가 필요하면 승인된 팩만 별도 도입 실험에서 확인한다. 외형 승인과 현재 Unity 버전에서의 기술 호환 확인을 구분한다.</w:t>
+        <w:t>최종 조합은 상태별 시각 검수 후 확정한다. Quaternius 원본 마네킹만 검수했으며 Synty·Kevin 팩 확보와 캐릭터 적용은 남았다. 상세 후보·제외 사유·이미지·파일 기록은 별도 에셋 애니메이션 검수안에 정리했다.</w:t>
       </w:r>
     </w:p>
     <w:p>
@@ -11294,7 +11398,7 @@
           <w:color w:val="000000"/>
           <w:sz w:val="22"/>
         </w:rPr>
-        <w:t>GitHub 리포지토리는 Public이며 main을 사용한다. Asset Store 원본 모델·텍스처·애니메이션은 공개 저장소에 재배포하지 않고 도입 위치를 추적 제외한다. 저장소에는 출처·버전·설치 순서·사용 클립 목록과 직접 작성한 로직을 남긴다. 설치 경로와 GUID 참조는 원본 패키지 도입 실험 후 고정하고 재현 절차를 적는다.</w:t>
+        <w:t>GitHub은 Public·main을 사용한다. 원본 에셋은 추적 제외하고 출처·버전·설치 순서·직접 작성한 로직과 검수 기록을 공개한다. GUID와 설치 절차는 실제 도입 후 고정한다.</w:t>
       </w:r>
     </w:p>
     <w:p>
@@ -11598,14 +11702,14 @@
           <w:color w:val="000000"/>
           <w:sz w:val="22"/>
         </w:rPr>
-        <w:t xml:space="preserve">복귀 </w:t>
+        <w:t xml:space="preserve">보완 </w:t>
       </w:r>
       <w:hyperlink r:id="rId25">
         <w:r>
           <w:rPr>
             <w:rFonts w:ascii="맑은 고딕" w:eastAsia="맑은 고딕"/>
           </w:rPr>
-          <w:t>RPG Character Mecanim Animation Pack FREE</w:t>
+          <w:t>Quaternius UAL1 공식 소개</w:t>
         </w:r>
       </w:hyperlink>
       <w:r>
@@ -11622,7 +11726,7 @@
           <w:rPr>
             <w:rFonts w:ascii="맑은 고딕" w:eastAsia="맑은 고딕"/>
           </w:rPr>
-          <w:t>제작자 공개 무료 목록</w:t>
+          <w:t>제작자의 무료 파일 배포</w:t>
         </w:r>
       </w:hyperlink>
     </w:p>
@@ -11635,7 +11739,44 @@
           <w:color w:val="000000"/>
           <w:sz w:val="22"/>
         </w:rPr>
-        <w:t>이번 수정은 기획과 공개 저장소 정리 및 에셋 조사다. 게임 기능 구현, 에셋 도입, Unity 플레이·성능·리타기팅 검증, 실제 콘솔 검증은 수행하지 않았다. 클로드의 별도 기획서는 원본 백업 후 수정을 보류했다.</w:t>
+        <w:t xml:space="preserve">복귀 </w:t>
+      </w:r>
+      <w:hyperlink r:id="rId27">
+        <w:r>
+          <w:rPr>
+            <w:rFonts w:ascii="맑은 고딕" w:eastAsia="맑은 고딕"/>
+          </w:rPr>
+          <w:t>Quaternius UAL2 공식 소개</w:t>
+        </w:r>
+      </w:hyperlink>
+      <w:r>
+        <w:rPr>
+          <w:rFonts w:ascii="맑은 고딕" w:hAnsi="맑은 고딕" w:eastAsia="맑은 고딕"/>
+          <w:b w:val="0"/>
+          <w:color w:val="000000"/>
+          <w:sz w:val="22"/>
+        </w:rPr>
+        <w:t xml:space="preserve"> · </w:t>
+      </w:r>
+      <w:hyperlink r:id="rId28">
+        <w:r>
+          <w:rPr>
+            <w:rFonts w:ascii="맑은 고딕" w:eastAsia="맑은 고딕"/>
+          </w:rPr>
+          <w:t>제작자의 무료 파일 배포</w:t>
+        </w:r>
+      </w:hyperlink>
+    </w:p>
+    <w:p>
+      <w:pPr/>
+      <w:r>
+        <w:rPr>
+          <w:rFonts w:ascii="맑은 고딕" w:hAnsi="맑은 고딕" w:eastAsia="맑은 고딕"/>
+          <w:b w:val="0"/>
+          <w:color w:val="000000"/>
+          <w:sz w:val="22"/>
+        </w:rPr>
+        <w:t>이번 수정은 기획과 에셋 조사 및 보완 무료 FBX의 원본 마네킹 임포트·포즈 검수다. 게임 기능 구현, Synty 리타기팅, 본 프로젝트 URP·온라인 플레이·성능 및 실제 콘솔 검증은 수행하지 않았다. 클로드의 별도 기획서는 원본 백업 후 수정을 보류했다.</w:t>
       </w:r>
     </w:p>
     <w:sectPr>
@@ -11651,7 +11792,7 @@
 
 <file path=word/comments.xml><?xml version="1.0" encoding="utf-8"?>
 <w:comments xmlns:a="http://schemas.openxmlformats.org/drawingml/2006/main" xmlns:pic="http://schemas.openxmlformats.org/drawingml/2006/picture" xmlns:r="http://schemas.openxmlformats.org/officeDocument/2006/relationships" xmlns:w="http://schemas.openxmlformats.org/wordprocessingml/2006/main" xmlns:wp="http://schemas.openxmlformats.org/drawingml/2006/wordprocessingDrawing" xmlns:mc="http://schemas.openxmlformats.org/markup-compatibility/2006" xmlns:a14="http://schemas.microsoft.com/office/drawing/2010/main" xmlns:w14="http://schemas.microsoft.com/office/word/2010/wordml" xmlns:wpc="http://schemas.microsoft.com/office/word/2010/wordprocessingCanvas">
-  <w:comment w:id="0" w:author="문서 검토" w:initials="검토" w:date="2026-10-26T08:04:16Z">
+  <w:comment w:id="0" w:author="문서 검토" w:initials="검토" w:date="2026-10-26T08:32:08Z">
     <w:p>
       <w:pPr>
         <w:pStyle w:val="CommentText"/>
@@ -11667,7 +11808,7 @@
       </w:r>
     </w:p>
   </w:comment>
-  <w:comment w:id="1" w:author="문서 검토" w:initials="검토" w:date="2026-10-26T08:04:16Z">
+  <w:comment w:id="1" w:author="문서 검토" w:initials="검토" w:date="2026-10-26T08:32:08Z">
     <w:p>
       <w:pPr>
         <w:pStyle w:val="CommentText"/>
@@ -11683,7 +11824,7 @@
       </w:r>
     </w:p>
   </w:comment>
-  <w:comment w:id="2" w:author="문서 검토" w:initials="검토" w:date="2026-10-26T08:04:16Z">
+  <w:comment w:id="2" w:author="문서 검토" w:initials="검토" w:date="2026-10-26T08:32:08Z">
     <w:p>
       <w:pPr>
         <w:pStyle w:val="CommentText"/>
@@ -11699,7 +11840,7 @@
       </w:r>
     </w:p>
   </w:comment>
-  <w:comment w:id="3" w:author="문서 검토" w:initials="검토" w:date="2026-10-26T08:04:16Z">
+  <w:comment w:id="3" w:author="문서 검토" w:initials="검토" w:date="2026-10-26T08:32:08Z">
     <w:p>
       <w:pPr>
         <w:pStyle w:val="CommentText"/>

</xml_diff>

<commit_message>
Verify Synty character retargeting and required shader dependency
</commit_message>
<xml_diff>
--- a/Docs/중력정비반_개인프로젝트_기획서.docx
+++ b/Docs/중력정비반_개인프로젝트_기획서.docx
@@ -31,7 +31,7 @@
           <w:color w:val="000000"/>
           <w:sz w:val="22"/>
         </w:rPr>
-        <w:t>2026년 10월 26일 · 수정안 1.2 · 무료 파일 검수 완료 및 A안 캐릭터 적용 검수 대기</w:t>
+        <w:t>2026년 10월 27일 · 수정안 1.3 · A안 캐릭터와 무료 모션 적용 검수</w:t>
       </w:r>
     </w:p>
     <w:p>
@@ -4846,7 +4846,6 @@
     </w:p>
     <w:p>
       <w:pPr/>
-      <w:commentRangeStart w:id="2"/>
       <w:r>
         <w:rPr>
           <w:rFonts w:ascii="맑은 고딕" w:hAnsi="맑은 고딕" w:eastAsia="맑은 고딕"/>
@@ -4854,14 +4853,7 @@
           <w:color w:val="000000"/>
           <w:sz w:val="22"/>
         </w:rPr>
-        <w:t>아래는 무료 공개 목록과 실제 파일을 구분한 후보이다. Kevin 팩은 공개 무료 목록을 확인했으며 실제 배포 버전 대조가 남았다. 보완 후보인 Quaternius Standard 2팩은 제작자 공식 배포본의 Unity FBX를 별도 Unity 6000.6 프로젝트에서 확인했다. Synty Avatar 적용 검수는 아직 수행하지 않았다.</w:t>
-      </w:r>
-      <w:commentRangeEnd w:id="2"/>
-      <w:r>
-        <w:rPr>
-          <w:rStyle w:val="CommentReference"/>
-        </w:rPr>
-        <w:commentReference w:id="2"/>
+        <w:t>무료 팩의 실제 파일과 Sidekick Starter_03 적용을 별도 Unity 6000.6 URP 17.6 프로젝트에서 확인했다. 클립 레코드 313개 중 17개 동작 후보를 상태별로 검수했다. 달리기와 장갑 상체 마스크 혼합 포즈도 확인했지만 제품 Animator·접촉·온라인 실행 검수는 남아 있다.</w:t>
       </w:r>
     </w:p>
     <w:tbl>
@@ -5035,7 +5027,7 @@
                 <w:color w:val="000000"/>
                 <w:sz w:val="20"/>
               </w:rPr>
-              <w:t>Human Basic Motions FREE · 제작자 무료 목록</w:t>
+              <w:t>Human Basic Motions FREE · 실물과 적용 확인</w:t>
             </w:r>
           </w:p>
         </w:tc>
@@ -5127,7 +5119,7 @@
                 <w:color w:val="000000"/>
                 <w:sz w:val="20"/>
               </w:rPr>
-              <w:t>Human Melee Animations FREE · 공격과 피격·사망 목록</w:t>
+              <w:t>Human Melee Animations FREE · 실물과 적용 확인</w:t>
             </w:r>
           </w:p>
         </w:tc>
@@ -5219,7 +5211,7 @@
                 <w:color w:val="000000"/>
                 <w:sz w:val="20"/>
               </w:rPr>
-              <w:t>Human Spellcasting Animations FREE · CastingEnter01, CastingIdle01, CastingExit01</w:t>
+              <w:t>Human Spellcasting Animations FREE · CastingEnter01, CastingIdle01, CastingExit01 적용 확인</w:t>
             </w:r>
           </w:p>
         </w:tc>
@@ -5660,7 +5652,7 @@
           <w:color w:val="000000"/>
           <w:sz w:val="22"/>
         </w:rPr>
-        <w:t>도입 검수는 대기→이동→점프, 잡은 채 이동, 잡기→피격, 근접→다운, 돌진→충돌→복귀, 구조 취소·완료를 각각 촬영한다. 루트 이동 중복, 발 접지, 팔 마스크 경계, 손·무기 위치와 클립 중단을 확인한다. 현재는 A안 외형을 기준으로 조사 중이며 최종 애니메이션 조합은 사용자 검수 후 확정한다.</w:t>
+        <w:t>도입 검수는 대기→이동→점프, 잡은 채 이동, 잡기→피격, 근접→다운, 돌진→충돌→복귀, 구조 취소·완료를 각각 촬영한다. 루트 이동 중복, 발 접지, 팔 마스크 경계, 손·무기 위치와 클립 중단을 확인한다. Starter_03은 SF 갑옷형 검수 기준이며 일반 정비복은 아니다. 실제 모습과 모션은 별도 검수안에서 사용자 시각 검수 후 확정한다.</w:t>
       </w:r>
     </w:p>
     <w:p>
@@ -7910,7 +7902,7 @@
     </w:p>
     <w:p>
       <w:pPr/>
-      <w:commentRangeStart w:id="3"/>
+      <w:commentRangeStart w:id="2"/>
       <w:r>
         <w:rPr>
           <w:rFonts w:ascii="맑은 고딕" w:hAnsi="맑은 고딕" w:eastAsia="맑은 고딕"/>
@@ -7920,12 +7912,12 @@
         </w:rPr>
         <w:t>기본 작업량은 에셋을 활용하는 소형 범위의 계획 추정이다. 실측 경험치가 없는 항목은 범위로 제시한다. 최초 기술 실험을 끝내면 실제 소요 시간으로 나머지를 다시 산정한다.</w:t>
       </w:r>
-      <w:commentRangeEnd w:id="3"/>
+      <w:commentRangeEnd w:id="2"/>
       <w:r>
         <w:rPr>
           <w:rStyle w:val="CommentReference"/>
         </w:rPr>
-        <w:commentReference w:id="3"/>
+        <w:commentReference w:id="2"/>
       </w:r>
     </w:p>
     <w:tbl>
@@ -10814,7 +10806,7 @@
                 <w:color w:val="000000"/>
                 <w:sz w:val="20"/>
               </w:rPr>
-              <w:t>무료 확인 · 실제 포함 모델 도입 검수 필요</w:t>
+              <w:t>실제 다운로드·임포트 완료 · 방 제작은 미검수</w:t>
             </w:r>
           </w:p>
         </w:tc>
@@ -10906,7 +10898,7 @@
                 <w:color w:val="000000"/>
                 <w:sz w:val="20"/>
               </w:rPr>
-              <w:t>무료·공개 URP 호환 정보 확인 · 도구 의존성 검수 필요</w:t>
+              <w:t>8개 Avatar 확인 · 전용 셰이더 의존성 보완 · Starter_03 적용 검수</w:t>
             </w:r>
           </w:p>
         </w:tc>
@@ -10998,7 +10990,7 @@
                 <w:color w:val="000000"/>
                 <w:sz w:val="20"/>
               </w:rPr>
-              <w:t>무료 클립 목록 확인 · 실제 Avatar 적용 미검증</w:t>
+              <w:t>실제 클립과 Starter_03 적용 확인</w:t>
             </w:r>
           </w:p>
         </w:tc>
@@ -11090,7 +11082,7 @@
                 <w:color w:val="000000"/>
                 <w:sz w:val="20"/>
               </w:rPr>
-              <w:t>무료 클립 목록 확인 · 판정 구간 맞춤 필요</w:t>
+              <w:t>실제 클립과 적용 확인 · 무기·판정 검수 전</w:t>
             </w:r>
           </w:p>
         </w:tc>
@@ -11182,7 +11174,7 @@
                 <w:color w:val="000000"/>
                 <w:sz w:val="20"/>
               </w:rPr>
-              <w:t>무료 목록 확인 · 기존 Crafting 후보를 재검토한 대안</w:t>
+              <w:t>실제 클립과 적용 확인 · 상체 혼합 포즈 확인</w:t>
             </w:r>
           </w:p>
         </w:tc>
@@ -11274,7 +11266,7 @@
                 <w:color w:val="000000"/>
                 <w:sz w:val="20"/>
               </w:rPr>
-              <w:t>공식 무료 FBX의 Humanoid와 사용 후보 포즈 확인 · Synty 적용 전</w:t>
+              <w:t>공식 무료 FBX와 Starter_03 적용 확인 · 접촉 검수 전</w:t>
             </w:r>
           </w:p>
         </w:tc>
@@ -11366,7 +11358,7 @@
                 <w:color w:val="000000"/>
                 <w:sz w:val="20"/>
               </w:rPr>
-              <w:t>공식 무료 FBX의 Humanoid와 사용 후보 포즈 확인 · 상태 연결 전</w:t>
+              <w:t>공식 무료 FBX와 Starter_03 적용 확인 · 상태 연결 전</w:t>
             </w:r>
           </w:p>
         </w:tc>
@@ -11386,7 +11378,7 @@
           <w:color w:val="000000"/>
           <w:sz w:val="22"/>
         </w:rPr>
-        <w:t>최종 조합은 상태별 시각 검수 후 확정한다. Quaternius 원본 마네킹만 검수했으며 Synty·Kevin 팩 확보와 캐릭터 적용은 남았다. 상세 후보·제외 사유·이미지·파일 기록은 별도 에셋 애니메이션 검수안에 정리했다.</w:t>
+        <w:t>최종 조합은 사용자 시각 검수 후 확정한다. 실제 캐릭터·모션·의존성·제외 사유·재생 자료는 별도 검수안에 기록했다. Sidekick 전용 셰이더는 공식 Tool 1.2.8 배포본에서 보완했으며 전체 제작 도구와 데이터베이스는 실행하지 않았다.</w:t>
       </w:r>
     </w:p>
     <w:p>
@@ -11419,7 +11411,7 @@
           <w:color w:val="000000"/>
           <w:sz w:val="22"/>
         </w:rPr>
-        <w:t>공고는 사용자가 첨부한 이미지 2장을 기준으로 삼았다. 기술·에셋 공개 페이지와 무료 목록은 2026년 10월 26일 확인했다. 문서에 있는 시간·성능·전투 수치는 측정 결과가 아닌 초기 계획값이다.</w:t>
+        <w:t>공고는 사용자가 첨부한 이미지 2장을 기준으로 삼았다. 공개 목록은 2026년 10월 26일, 실제 파일과 Synty 적용은 27일 확인했다. 일정·성능·전투 목표 수치는 초기 계획값이며 클립 길이와 메시 수의 실물 검수 기록과 구분한다.</w:t>
       </w:r>
     </w:p>
     <w:p>
@@ -11776,7 +11768,7 @@
           <w:color w:val="000000"/>
           <w:sz w:val="22"/>
         </w:rPr>
-        <w:t>이번 수정은 기획과 에셋 조사 및 보완 무료 FBX의 원본 마네킹 임포트·포즈 검수다. 게임 기능 구현, Synty 리타기팅, 본 프로젝트 URP·온라인 플레이·성능 및 실제 콘솔 검증은 수행하지 않았다. 클로드의 별도 기획서는 원본 백업 후 수정을 보류했다.</w:t>
+        <w:t>이번 수정은 기획과 실제 무료 파일·Synty 캐릭터 적용 및 별도 URP 프로젝트의 대표 모션 검수다. 제품 게임 기능·Animator 전이·접촉·온라인 플레이·성능 및 실제 콘솔 검증은 수행하지 않았다. 클로드의 별도 기획서는 원본 백업 후 수정을 보류했다.</w:t>
       </w:r>
     </w:p>
     <w:sectPr>
@@ -11792,7 +11784,7 @@
 
 <file path=word/comments.xml><?xml version="1.0" encoding="utf-8"?>
 <w:comments xmlns:a="http://schemas.openxmlformats.org/drawingml/2006/main" xmlns:pic="http://schemas.openxmlformats.org/drawingml/2006/picture" xmlns:r="http://schemas.openxmlformats.org/officeDocument/2006/relationships" xmlns:w="http://schemas.openxmlformats.org/wordprocessingml/2006/main" xmlns:wp="http://schemas.openxmlformats.org/drawingml/2006/wordprocessingDrawing" xmlns:mc="http://schemas.openxmlformats.org/markup-compatibility/2006" xmlns:a14="http://schemas.microsoft.com/office/drawing/2010/main" xmlns:w14="http://schemas.microsoft.com/office/word/2010/wordml" xmlns:wpc="http://schemas.microsoft.com/office/word/2010/wordprocessingCanvas">
-  <w:comment w:id="0" w:author="문서 검토" w:initials="검토" w:date="2026-10-26T08:32:08Z">
+  <w:comment w:id="0" w:author="문서 검토" w:initials="검토" w:date="2026-10-27T00:23:39Z">
     <w:p>
       <w:pPr>
         <w:pStyle w:val="CommentText"/>
@@ -11808,7 +11800,7 @@
       </w:r>
     </w:p>
   </w:comment>
-  <w:comment w:id="1" w:author="문서 검토" w:initials="검토" w:date="2026-10-26T08:32:08Z">
+  <w:comment w:id="1" w:author="문서 검토" w:initials="검토" w:date="2026-10-27T00:23:39Z">
     <w:p>
       <w:pPr>
         <w:pStyle w:val="CommentText"/>
@@ -11824,23 +11816,7 @@
       </w:r>
     </w:p>
   </w:comment>
-  <w:comment w:id="2" w:author="문서 검토" w:initials="검토" w:date="2026-10-26T08:32:08Z">
-    <w:p>
-      <w:pPr>
-        <w:pStyle w:val="CommentText"/>
-      </w:pPr>
-      <w:r>
-        <w:rPr>
-          <w:rStyle w:val="CommentReference"/>
-        </w:rPr>
-        <w:annotationRef/>
-      </w:r>
-      <w:r>
-        <w:t>무료 클립 목록 확인과 실제 패키지의 리타기팅 검증을 구분했습니다. 전용 동작 미확보 부분도 남겼습니다.</w:t>
-      </w:r>
-    </w:p>
-  </w:comment>
-  <w:comment w:id="3" w:author="문서 검토" w:initials="검토" w:date="2026-10-26T08:32:08Z">
+  <w:comment w:id="2" w:author="문서 검토" w:initials="검토" w:date="2026-10-27T00:23:39Z">
     <w:p>
       <w:pPr>
         <w:pStyle w:val="CommentText"/>
@@ -11873,7 +11849,7 @@
         <w:color w:val="000000"/>
         <w:sz w:val="18"/>
       </w:rPr>
-      <w:t xml:space="preserve">2026년 10월 26일   ·   </w:t>
+      <w:t xml:space="preserve">2026년 10월 27일   ·   </w:t>
     </w:r>
     <w:fldSimple w:instr="PAGE"/>
   </w:p>

</xml_diff>